<commit_message>
feature: add descriptive statistics per condition to table
</commit_message>
<xml_diff>
--- a/Python.Analysis/descriptive_statistics.docx
+++ b/Python.Analysis/descriptive_statistics.docx
@@ -23,16 +23,17 @@
         <w:tblLook w:firstColumn="1" w:firstRow="1" w:lastColumn="0" w:lastRow="0" w:noHBand="0" w:noVBand="1" w:val="04A0"/>
       </w:tblPr>
       <w:tblGrid>
-        <w:gridCol w:w="1872"/>
-        <w:gridCol w:w="1872"/>
-        <w:gridCol w:w="1872"/>
-        <w:gridCol w:w="1872"/>
-        <w:gridCol w:w="1872"/>
+        <w:gridCol w:w="1560"/>
+        <w:gridCol w:w="1560"/>
+        <w:gridCol w:w="1560"/>
+        <w:gridCol w:w="1560"/>
+        <w:gridCol w:w="1560"/>
+        <w:gridCol w:w="1560"/>
       </w:tblGrid>
       <w:tr>
         <w:tc>
           <w:tcPr>
-            <w:tcW w:type="dxa" w:w="1872"/>
+            <w:tcW w:type="dxa" w:w="1560"/>
             <w:tcBorders>
               <w:top w:sz="12" w:val="single"/>
               <w:bottom w:sz="6" w:val="single"/>
@@ -53,7 +54,28 @@
         </w:tc>
         <w:tc>
           <w:tcPr>
-            <w:tcW w:type="dxa" w:w="1872"/>
+            <w:tcW w:type="dxa" w:w="1560"/>
+            <w:tcBorders>
+              <w:top w:sz="12" w:val="single"/>
+              <w:bottom w:sz="6" w:val="single"/>
+            </w:tcBorders>
+          </w:tcPr>
+          <w:p>
+            <w:pPr>
+              <w:jc w:val="center"/>
+            </w:pPr>
+            <w:r>
+              <w:rPr>
+                <w:rFonts w:ascii="Calibri" w:hAnsi="Calibri"/>
+                <w:sz w:val="22"/>
+              </w:rPr>
+              <w:t>Condition</w:t>
+            </w:r>
+          </w:p>
+        </w:tc>
+        <w:tc>
+          <w:tcPr>
+            <w:tcW w:type="dxa" w:w="1560"/>
             <w:tcBorders>
               <w:top w:sz="12" w:val="single"/>
               <w:bottom w:sz="6" w:val="single"/>
@@ -74,7 +96,7 @@
         </w:tc>
         <w:tc>
           <w:tcPr>
-            <w:tcW w:type="dxa" w:w="1872"/>
+            <w:tcW w:type="dxa" w:w="1560"/>
             <w:tcBorders>
               <w:top w:sz="12" w:val="single"/>
               <w:bottom w:sz="6" w:val="single"/>
@@ -95,7 +117,7 @@
         </w:tc>
         <w:tc>
           <w:tcPr>
-            <w:tcW w:type="dxa" w:w="1872"/>
+            <w:tcW w:type="dxa" w:w="1560"/>
             <w:tcBorders>
               <w:top w:sz="12" w:val="single"/>
               <w:bottom w:sz="6" w:val="single"/>
@@ -116,7 +138,7 @@
         </w:tc>
         <w:tc>
           <w:tcPr>
-            <w:tcW w:type="dxa" w:w="1872"/>
+            <w:tcW w:type="dxa" w:w="1560"/>
             <w:tcBorders>
               <w:top w:sz="12" w:val="single"/>
               <w:bottom w:sz="6" w:val="single"/>
@@ -139,7 +161,7 @@
       <w:tr>
         <w:tc>
           <w:tcPr>
-            <w:tcW w:type="dxa" w:w="1872"/>
+            <w:tcW w:type="dxa" w:w="1560"/>
           </w:tcPr>
           <w:p>
             <w:pPr>
@@ -156,7 +178,24 @@
         </w:tc>
         <w:tc>
           <w:tcPr>
-            <w:tcW w:type="dxa" w:w="1872"/>
+            <w:tcW w:type="dxa" w:w="1560"/>
+          </w:tcPr>
+          <w:p>
+            <w:pPr>
+              <w:jc w:val="center"/>
+            </w:pPr>
+            <w:r>
+              <w:rPr>
+                <w:rFonts w:ascii="Calibri" w:hAnsi="Calibri"/>
+                <w:sz w:val="22"/>
+              </w:rPr>
+              <w:t>Across conditions</w:t>
+            </w:r>
+          </w:p>
+        </w:tc>
+        <w:tc>
+          <w:tcPr>
+            <w:tcW w:type="dxa" w:w="1560"/>
           </w:tcPr>
           <w:p>
             <w:pPr>
@@ -173,7 +212,7 @@
         </w:tc>
         <w:tc>
           <w:tcPr>
-            <w:tcW w:type="dxa" w:w="1872"/>
+            <w:tcW w:type="dxa" w:w="1560"/>
           </w:tcPr>
           <w:p>
             <w:pPr>
@@ -190,7 +229,7 @@
         </w:tc>
         <w:tc>
           <w:tcPr>
-            <w:tcW w:type="dxa" w:w="1872"/>
+            <w:tcW w:type="dxa" w:w="1560"/>
           </w:tcPr>
           <w:p>
             <w:pPr>
@@ -207,7 +246,7 @@
         </w:tc>
         <w:tc>
           <w:tcPr>
-            <w:tcW w:type="dxa" w:w="1872"/>
+            <w:tcW w:type="dxa" w:w="1560"/>
           </w:tcPr>
           <w:p>
             <w:pPr>
@@ -226,7 +265,419 @@
       <w:tr>
         <w:tc>
           <w:tcPr>
-            <w:tcW w:type="dxa" w:w="1872"/>
+            <w:tcW w:type="dxa" w:w="1560"/>
+          </w:tcPr>
+          <w:p>
+            <w:pPr>
+              <w:jc w:val="center"/>
+            </w:pPr>
+            <w:r>
+              <w:rPr>
+                <w:rFonts w:ascii="Calibri" w:hAnsi="Calibri"/>
+                <w:sz w:val="22"/>
+              </w:rPr>
+            </w:r>
+          </w:p>
+        </w:tc>
+        <w:tc>
+          <w:tcPr>
+            <w:tcW w:type="dxa" w:w="1560"/>
+          </w:tcPr>
+          <w:p>
+            <w:pPr>
+              <w:jc w:val="center"/>
+            </w:pPr>
+            <w:r>
+              <w:rPr>
+                <w:rFonts w:ascii="Calibri" w:hAnsi="Calibri"/>
+                <w:sz w:val="22"/>
+              </w:rPr>
+              <w:t>No-opponent</w:t>
+            </w:r>
+          </w:p>
+        </w:tc>
+        <w:tc>
+          <w:tcPr>
+            <w:tcW w:type="dxa" w:w="1560"/>
+          </w:tcPr>
+          <w:p>
+            <w:pPr>
+              <w:jc w:val="center"/>
+            </w:pPr>
+            <w:r>
+              <w:rPr>
+                <w:rFonts w:ascii="Calibri" w:hAnsi="Calibri"/>
+                <w:sz w:val="22"/>
+              </w:rPr>
+              <w:t>2.4</w:t>
+            </w:r>
+          </w:p>
+        </w:tc>
+        <w:tc>
+          <w:tcPr>
+            <w:tcW w:type="dxa" w:w="1560"/>
+          </w:tcPr>
+          <w:p>
+            <w:pPr>
+              <w:jc w:val="center"/>
+            </w:pPr>
+            <w:r>
+              <w:rPr>
+                <w:rFonts w:ascii="Calibri" w:hAnsi="Calibri"/>
+                <w:sz w:val="22"/>
+              </w:rPr>
+              <w:t>0.6</w:t>
+            </w:r>
+          </w:p>
+        </w:tc>
+        <w:tc>
+          <w:tcPr>
+            <w:tcW w:type="dxa" w:w="1560"/>
+          </w:tcPr>
+          <w:p>
+            <w:pPr>
+              <w:jc w:val="center"/>
+            </w:pPr>
+            <w:r>
+              <w:rPr>
+                <w:rFonts w:ascii="Calibri" w:hAnsi="Calibri"/>
+                <w:sz w:val="22"/>
+              </w:rPr>
+              <w:t>2.0</w:t>
+            </w:r>
+          </w:p>
+        </w:tc>
+        <w:tc>
+          <w:tcPr>
+            <w:tcW w:type="dxa" w:w="1560"/>
+          </w:tcPr>
+          <w:p>
+            <w:pPr>
+              <w:jc w:val="center"/>
+            </w:pPr>
+            <w:r>
+              <w:rPr>
+                <w:rFonts w:ascii="Calibri" w:hAnsi="Calibri"/>
+                <w:sz w:val="22"/>
+              </w:rPr>
+              <w:t>5.0</w:t>
+            </w:r>
+          </w:p>
+        </w:tc>
+      </w:tr>
+      <w:tr>
+        <w:tc>
+          <w:tcPr>
+            <w:tcW w:type="dxa" w:w="1560"/>
+          </w:tcPr>
+          <w:p>
+            <w:pPr>
+              <w:jc w:val="center"/>
+            </w:pPr>
+            <w:r>
+              <w:rPr>
+                <w:rFonts w:ascii="Calibri" w:hAnsi="Calibri"/>
+                <w:sz w:val="22"/>
+              </w:rPr>
+            </w:r>
+          </w:p>
+        </w:tc>
+        <w:tc>
+          <w:tcPr>
+            <w:tcW w:type="dxa" w:w="1560"/>
+          </w:tcPr>
+          <w:p>
+            <w:pPr>
+              <w:jc w:val="center"/>
+            </w:pPr>
+            <w:r>
+              <w:rPr>
+                <w:rFonts w:ascii="Calibri" w:hAnsi="Calibri"/>
+                <w:sz w:val="22"/>
+              </w:rPr>
+              <w:t>Non-interactive opponent</w:t>
+            </w:r>
+          </w:p>
+        </w:tc>
+        <w:tc>
+          <w:tcPr>
+            <w:tcW w:type="dxa" w:w="1560"/>
+          </w:tcPr>
+          <w:p>
+            <w:pPr>
+              <w:jc w:val="center"/>
+            </w:pPr>
+            <w:r>
+              <w:rPr>
+                <w:rFonts w:ascii="Calibri" w:hAnsi="Calibri"/>
+                <w:sz w:val="22"/>
+              </w:rPr>
+              <w:t>2.9</w:t>
+            </w:r>
+          </w:p>
+        </w:tc>
+        <w:tc>
+          <w:tcPr>
+            <w:tcW w:type="dxa" w:w="1560"/>
+          </w:tcPr>
+          <w:p>
+            <w:pPr>
+              <w:jc w:val="center"/>
+            </w:pPr>
+            <w:r>
+              <w:rPr>
+                <w:rFonts w:ascii="Calibri" w:hAnsi="Calibri"/>
+                <w:sz w:val="22"/>
+              </w:rPr>
+              <w:t>0.7</w:t>
+            </w:r>
+          </w:p>
+        </w:tc>
+        <w:tc>
+          <w:tcPr>
+            <w:tcW w:type="dxa" w:w="1560"/>
+          </w:tcPr>
+          <w:p>
+            <w:pPr>
+              <w:jc w:val="center"/>
+            </w:pPr>
+            <w:r>
+              <w:rPr>
+                <w:rFonts w:ascii="Calibri" w:hAnsi="Calibri"/>
+                <w:sz w:val="22"/>
+              </w:rPr>
+              <w:t>2.0</w:t>
+            </w:r>
+          </w:p>
+        </w:tc>
+        <w:tc>
+          <w:tcPr>
+            <w:tcW w:type="dxa" w:w="1560"/>
+          </w:tcPr>
+          <w:p>
+            <w:pPr>
+              <w:jc w:val="center"/>
+            </w:pPr>
+            <w:r>
+              <w:rPr>
+                <w:rFonts w:ascii="Calibri" w:hAnsi="Calibri"/>
+                <w:sz w:val="22"/>
+              </w:rPr>
+              <w:t>5.0</w:t>
+            </w:r>
+          </w:p>
+        </w:tc>
+      </w:tr>
+      <w:tr>
+        <w:tc>
+          <w:tcPr>
+            <w:tcW w:type="dxa" w:w="1560"/>
+          </w:tcPr>
+          <w:p>
+            <w:pPr>
+              <w:jc w:val="center"/>
+            </w:pPr>
+            <w:r>
+              <w:rPr>
+                <w:rFonts w:ascii="Calibri" w:hAnsi="Calibri"/>
+                <w:sz w:val="22"/>
+              </w:rPr>
+            </w:r>
+          </w:p>
+        </w:tc>
+        <w:tc>
+          <w:tcPr>
+            <w:tcW w:type="dxa" w:w="1560"/>
+          </w:tcPr>
+          <w:p>
+            <w:pPr>
+              <w:jc w:val="center"/>
+            </w:pPr>
+            <w:r>
+              <w:rPr>
+                <w:rFonts w:ascii="Calibri" w:hAnsi="Calibri"/>
+                <w:sz w:val="22"/>
+              </w:rPr>
+              <w:t>Interactive opponent</w:t>
+            </w:r>
+          </w:p>
+        </w:tc>
+        <w:tc>
+          <w:tcPr>
+            <w:tcW w:type="dxa" w:w="1560"/>
+          </w:tcPr>
+          <w:p>
+            <w:pPr>
+              <w:jc w:val="center"/>
+            </w:pPr>
+            <w:r>
+              <w:rPr>
+                <w:rFonts w:ascii="Calibri" w:hAnsi="Calibri"/>
+                <w:sz w:val="22"/>
+              </w:rPr>
+              <w:t>4.3</w:t>
+            </w:r>
+          </w:p>
+        </w:tc>
+        <w:tc>
+          <w:tcPr>
+            <w:tcW w:type="dxa" w:w="1560"/>
+          </w:tcPr>
+          <w:p>
+            <w:pPr>
+              <w:jc w:val="center"/>
+            </w:pPr>
+            <w:r>
+              <w:rPr>
+                <w:rFonts w:ascii="Calibri" w:hAnsi="Calibri"/>
+                <w:sz w:val="22"/>
+              </w:rPr>
+              <w:t>1.6</w:t>
+            </w:r>
+          </w:p>
+        </w:tc>
+        <w:tc>
+          <w:tcPr>
+            <w:tcW w:type="dxa" w:w="1560"/>
+          </w:tcPr>
+          <w:p>
+            <w:pPr>
+              <w:jc w:val="center"/>
+            </w:pPr>
+            <w:r>
+              <w:rPr>
+                <w:rFonts w:ascii="Calibri" w:hAnsi="Calibri"/>
+                <w:sz w:val="22"/>
+              </w:rPr>
+              <w:t>2.0</w:t>
+            </w:r>
+          </w:p>
+        </w:tc>
+        <w:tc>
+          <w:tcPr>
+            <w:tcW w:type="dxa" w:w="1560"/>
+          </w:tcPr>
+          <w:p>
+            <w:pPr>
+              <w:jc w:val="center"/>
+            </w:pPr>
+            <w:r>
+              <w:rPr>
+                <w:rFonts w:ascii="Calibri" w:hAnsi="Calibri"/>
+                <w:sz w:val="22"/>
+              </w:rPr>
+              <w:t>10.0</w:t>
+            </w:r>
+          </w:p>
+        </w:tc>
+      </w:tr>
+      <w:tr>
+        <w:tc>
+          <w:tcPr>
+            <w:tcW w:type="dxa" w:w="1560"/>
+          </w:tcPr>
+          <w:p>
+            <w:pPr>
+              <w:jc w:val="center"/>
+            </w:pPr>
+            <w:r>
+              <w:rPr>
+                <w:rFonts w:ascii="Calibri" w:hAnsi="Calibri"/>
+                <w:sz w:val="22"/>
+              </w:rPr>
+            </w:r>
+          </w:p>
+        </w:tc>
+        <w:tc>
+          <w:tcPr>
+            <w:tcW w:type="dxa" w:w="1560"/>
+          </w:tcPr>
+          <w:p>
+            <w:pPr>
+              <w:jc w:val="center"/>
+            </w:pPr>
+            <w:r>
+              <w:rPr>
+                <w:rFonts w:ascii="Calibri" w:hAnsi="Calibri"/>
+                <w:sz w:val="22"/>
+              </w:rPr>
+              <w:t>In situ opponent</w:t>
+            </w:r>
+          </w:p>
+        </w:tc>
+        <w:tc>
+          <w:tcPr>
+            <w:tcW w:type="dxa" w:w="1560"/>
+          </w:tcPr>
+          <w:p>
+            <w:pPr>
+              <w:jc w:val="center"/>
+            </w:pPr>
+            <w:r>
+              <w:rPr>
+                <w:rFonts w:ascii="Calibri" w:hAnsi="Calibri"/>
+                <w:sz w:val="22"/>
+              </w:rPr>
+              <w:t>5.4</w:t>
+            </w:r>
+          </w:p>
+        </w:tc>
+        <w:tc>
+          <w:tcPr>
+            <w:tcW w:type="dxa" w:w="1560"/>
+          </w:tcPr>
+          <w:p>
+            <w:pPr>
+              <w:jc w:val="center"/>
+            </w:pPr>
+            <w:r>
+              <w:rPr>
+                <w:rFonts w:ascii="Calibri" w:hAnsi="Calibri"/>
+                <w:sz w:val="22"/>
+              </w:rPr>
+              <w:t>3.4</w:t>
+            </w:r>
+          </w:p>
+        </w:tc>
+        <w:tc>
+          <w:tcPr>
+            <w:tcW w:type="dxa" w:w="1560"/>
+          </w:tcPr>
+          <w:p>
+            <w:pPr>
+              <w:jc w:val="center"/>
+            </w:pPr>
+            <w:r>
+              <w:rPr>
+                <w:rFonts w:ascii="Calibri" w:hAnsi="Calibri"/>
+                <w:sz w:val="22"/>
+              </w:rPr>
+              <w:t>2.0</w:t>
+            </w:r>
+          </w:p>
+        </w:tc>
+        <w:tc>
+          <w:tcPr>
+            <w:tcW w:type="dxa" w:w="1560"/>
+          </w:tcPr>
+          <w:p>
+            <w:pPr>
+              <w:jc w:val="center"/>
+            </w:pPr>
+            <w:r>
+              <w:rPr>
+                <w:rFonts w:ascii="Calibri" w:hAnsi="Calibri"/>
+                <w:sz w:val="22"/>
+              </w:rPr>
+              <w:t>19.0</w:t>
+            </w:r>
+          </w:p>
+        </w:tc>
+      </w:tr>
+      <w:tr>
+        <w:tc>
+          <w:tcPr>
+            <w:tcW w:type="dxa" w:w="1560"/>
           </w:tcPr>
           <w:p>
             <w:pPr>
@@ -243,7 +694,24 @@
         </w:tc>
         <w:tc>
           <w:tcPr>
-            <w:tcW w:type="dxa" w:w="1872"/>
+            <w:tcW w:type="dxa" w:w="1560"/>
+          </w:tcPr>
+          <w:p>
+            <w:pPr>
+              <w:jc w:val="center"/>
+            </w:pPr>
+            <w:r>
+              <w:rPr>
+                <w:rFonts w:ascii="Calibri" w:hAnsi="Calibri"/>
+                <w:sz w:val="22"/>
+              </w:rPr>
+              <w:t>Across conditions</w:t>
+            </w:r>
+          </w:p>
+        </w:tc>
+        <w:tc>
+          <w:tcPr>
+            <w:tcW w:type="dxa" w:w="1560"/>
           </w:tcPr>
           <w:p>
             <w:pPr>
@@ -260,7 +728,7 @@
         </w:tc>
         <w:tc>
           <w:tcPr>
-            <w:tcW w:type="dxa" w:w="1872"/>
+            <w:tcW w:type="dxa" w:w="1560"/>
           </w:tcPr>
           <w:p>
             <w:pPr>
@@ -277,7 +745,7 @@
         </w:tc>
         <w:tc>
           <w:tcPr>
-            <w:tcW w:type="dxa" w:w="1872"/>
+            <w:tcW w:type="dxa" w:w="1560"/>
           </w:tcPr>
           <w:p>
             <w:pPr>
@@ -294,7 +762,7 @@
         </w:tc>
         <w:tc>
           <w:tcPr>
-            <w:tcW w:type="dxa" w:w="1872"/>
+            <w:tcW w:type="dxa" w:w="1560"/>
           </w:tcPr>
           <w:p>
             <w:pPr>
@@ -313,7 +781,419 @@
       <w:tr>
         <w:tc>
           <w:tcPr>
-            <w:tcW w:type="dxa" w:w="1872"/>
+            <w:tcW w:type="dxa" w:w="1560"/>
+          </w:tcPr>
+          <w:p>
+            <w:pPr>
+              <w:jc w:val="center"/>
+            </w:pPr>
+            <w:r>
+              <w:rPr>
+                <w:rFonts w:ascii="Calibri" w:hAnsi="Calibri"/>
+                <w:sz w:val="22"/>
+              </w:rPr>
+            </w:r>
+          </w:p>
+        </w:tc>
+        <w:tc>
+          <w:tcPr>
+            <w:tcW w:type="dxa" w:w="1560"/>
+          </w:tcPr>
+          <w:p>
+            <w:pPr>
+              <w:jc w:val="center"/>
+            </w:pPr>
+            <w:r>
+              <w:rPr>
+                <w:rFonts w:ascii="Calibri" w:hAnsi="Calibri"/>
+                <w:sz w:val="22"/>
+              </w:rPr>
+              <w:t>No-opponent</w:t>
+            </w:r>
+          </w:p>
+        </w:tc>
+        <w:tc>
+          <w:tcPr>
+            <w:tcW w:type="dxa" w:w="1560"/>
+          </w:tcPr>
+          <w:p>
+            <w:pPr>
+              <w:jc w:val="center"/>
+            </w:pPr>
+            <w:r>
+              <w:rPr>
+                <w:rFonts w:ascii="Calibri" w:hAnsi="Calibri"/>
+                <w:sz w:val="22"/>
+              </w:rPr>
+              <w:t>1.4</w:t>
+            </w:r>
+          </w:p>
+        </w:tc>
+        <w:tc>
+          <w:tcPr>
+            <w:tcW w:type="dxa" w:w="1560"/>
+          </w:tcPr>
+          <w:p>
+            <w:pPr>
+              <w:jc w:val="center"/>
+            </w:pPr>
+            <w:r>
+              <w:rPr>
+                <w:rFonts w:ascii="Calibri" w:hAnsi="Calibri"/>
+                <w:sz w:val="22"/>
+              </w:rPr>
+              <w:t>0.5</w:t>
+            </w:r>
+          </w:p>
+        </w:tc>
+        <w:tc>
+          <w:tcPr>
+            <w:tcW w:type="dxa" w:w="1560"/>
+          </w:tcPr>
+          <w:p>
+            <w:pPr>
+              <w:jc w:val="center"/>
+            </w:pPr>
+            <w:r>
+              <w:rPr>
+                <w:rFonts w:ascii="Calibri" w:hAnsi="Calibri"/>
+                <w:sz w:val="22"/>
+              </w:rPr>
+              <w:t>0.5</w:t>
+            </w:r>
+          </w:p>
+        </w:tc>
+        <w:tc>
+          <w:tcPr>
+            <w:tcW w:type="dxa" w:w="1560"/>
+          </w:tcPr>
+          <w:p>
+            <w:pPr>
+              <w:jc w:val="center"/>
+            </w:pPr>
+            <w:r>
+              <w:rPr>
+                <w:rFonts w:ascii="Calibri" w:hAnsi="Calibri"/>
+                <w:sz w:val="22"/>
+              </w:rPr>
+              <w:t>3.2</w:t>
+            </w:r>
+          </w:p>
+        </w:tc>
+      </w:tr>
+      <w:tr>
+        <w:tc>
+          <w:tcPr>
+            <w:tcW w:type="dxa" w:w="1560"/>
+          </w:tcPr>
+          <w:p>
+            <w:pPr>
+              <w:jc w:val="center"/>
+            </w:pPr>
+            <w:r>
+              <w:rPr>
+                <w:rFonts w:ascii="Calibri" w:hAnsi="Calibri"/>
+                <w:sz w:val="22"/>
+              </w:rPr>
+            </w:r>
+          </w:p>
+        </w:tc>
+        <w:tc>
+          <w:tcPr>
+            <w:tcW w:type="dxa" w:w="1560"/>
+          </w:tcPr>
+          <w:p>
+            <w:pPr>
+              <w:jc w:val="center"/>
+            </w:pPr>
+            <w:r>
+              <w:rPr>
+                <w:rFonts w:ascii="Calibri" w:hAnsi="Calibri"/>
+                <w:sz w:val="22"/>
+              </w:rPr>
+              <w:t>Non-interactive opponent</w:t>
+            </w:r>
+          </w:p>
+        </w:tc>
+        <w:tc>
+          <w:tcPr>
+            <w:tcW w:type="dxa" w:w="1560"/>
+          </w:tcPr>
+          <w:p>
+            <w:pPr>
+              <w:jc w:val="center"/>
+            </w:pPr>
+            <w:r>
+              <w:rPr>
+                <w:rFonts w:ascii="Calibri" w:hAnsi="Calibri"/>
+                <w:sz w:val="22"/>
+              </w:rPr>
+              <w:t>1.8</w:t>
+            </w:r>
+          </w:p>
+        </w:tc>
+        <w:tc>
+          <w:tcPr>
+            <w:tcW w:type="dxa" w:w="1560"/>
+          </w:tcPr>
+          <w:p>
+            <w:pPr>
+              <w:jc w:val="center"/>
+            </w:pPr>
+            <w:r>
+              <w:rPr>
+                <w:rFonts w:ascii="Calibri" w:hAnsi="Calibri"/>
+                <w:sz w:val="22"/>
+              </w:rPr>
+              <w:t>0.5</w:t>
+            </w:r>
+          </w:p>
+        </w:tc>
+        <w:tc>
+          <w:tcPr>
+            <w:tcW w:type="dxa" w:w="1560"/>
+          </w:tcPr>
+          <w:p>
+            <w:pPr>
+              <w:jc w:val="center"/>
+            </w:pPr>
+            <w:r>
+              <w:rPr>
+                <w:rFonts w:ascii="Calibri" w:hAnsi="Calibri"/>
+                <w:sz w:val="22"/>
+              </w:rPr>
+              <w:t>0.5</w:t>
+            </w:r>
+          </w:p>
+        </w:tc>
+        <w:tc>
+          <w:tcPr>
+            <w:tcW w:type="dxa" w:w="1560"/>
+          </w:tcPr>
+          <w:p>
+            <w:pPr>
+              <w:jc w:val="center"/>
+            </w:pPr>
+            <w:r>
+              <w:rPr>
+                <w:rFonts w:ascii="Calibri" w:hAnsi="Calibri"/>
+                <w:sz w:val="22"/>
+              </w:rPr>
+              <w:t>3.5</w:t>
+            </w:r>
+          </w:p>
+        </w:tc>
+      </w:tr>
+      <w:tr>
+        <w:tc>
+          <w:tcPr>
+            <w:tcW w:type="dxa" w:w="1560"/>
+          </w:tcPr>
+          <w:p>
+            <w:pPr>
+              <w:jc w:val="center"/>
+            </w:pPr>
+            <w:r>
+              <w:rPr>
+                <w:rFonts w:ascii="Calibri" w:hAnsi="Calibri"/>
+                <w:sz w:val="22"/>
+              </w:rPr>
+            </w:r>
+          </w:p>
+        </w:tc>
+        <w:tc>
+          <w:tcPr>
+            <w:tcW w:type="dxa" w:w="1560"/>
+          </w:tcPr>
+          <w:p>
+            <w:pPr>
+              <w:jc w:val="center"/>
+            </w:pPr>
+            <w:r>
+              <w:rPr>
+                <w:rFonts w:ascii="Calibri" w:hAnsi="Calibri"/>
+                <w:sz w:val="22"/>
+              </w:rPr>
+              <w:t>Interactive opponent</w:t>
+            </w:r>
+          </w:p>
+        </w:tc>
+        <w:tc>
+          <w:tcPr>
+            <w:tcW w:type="dxa" w:w="1560"/>
+          </w:tcPr>
+          <w:p>
+            <w:pPr>
+              <w:jc w:val="center"/>
+            </w:pPr>
+            <w:r>
+              <w:rPr>
+                <w:rFonts w:ascii="Calibri" w:hAnsi="Calibri"/>
+                <w:sz w:val="22"/>
+              </w:rPr>
+              <w:t>2.7</w:t>
+            </w:r>
+          </w:p>
+        </w:tc>
+        <w:tc>
+          <w:tcPr>
+            <w:tcW w:type="dxa" w:w="1560"/>
+          </w:tcPr>
+          <w:p>
+            <w:pPr>
+              <w:jc w:val="center"/>
+            </w:pPr>
+            <w:r>
+              <w:rPr>
+                <w:rFonts w:ascii="Calibri" w:hAnsi="Calibri"/>
+                <w:sz w:val="22"/>
+              </w:rPr>
+              <w:t>1.3</w:t>
+            </w:r>
+          </w:p>
+        </w:tc>
+        <w:tc>
+          <w:tcPr>
+            <w:tcW w:type="dxa" w:w="1560"/>
+          </w:tcPr>
+          <w:p>
+            <w:pPr>
+              <w:jc w:val="center"/>
+            </w:pPr>
+            <w:r>
+              <w:rPr>
+                <w:rFonts w:ascii="Calibri" w:hAnsi="Calibri"/>
+                <w:sz w:val="22"/>
+              </w:rPr>
+              <w:t>0.8</w:t>
+            </w:r>
+          </w:p>
+        </w:tc>
+        <w:tc>
+          <w:tcPr>
+            <w:tcW w:type="dxa" w:w="1560"/>
+          </w:tcPr>
+          <w:p>
+            <w:pPr>
+              <w:jc w:val="center"/>
+            </w:pPr>
+            <w:r>
+              <w:rPr>
+                <w:rFonts w:ascii="Calibri" w:hAnsi="Calibri"/>
+                <w:sz w:val="22"/>
+              </w:rPr>
+              <w:t>8.3</w:t>
+            </w:r>
+          </w:p>
+        </w:tc>
+      </w:tr>
+      <w:tr>
+        <w:tc>
+          <w:tcPr>
+            <w:tcW w:type="dxa" w:w="1560"/>
+          </w:tcPr>
+          <w:p>
+            <w:pPr>
+              <w:jc w:val="center"/>
+            </w:pPr>
+            <w:r>
+              <w:rPr>
+                <w:rFonts w:ascii="Calibri" w:hAnsi="Calibri"/>
+                <w:sz w:val="22"/>
+              </w:rPr>
+            </w:r>
+          </w:p>
+        </w:tc>
+        <w:tc>
+          <w:tcPr>
+            <w:tcW w:type="dxa" w:w="1560"/>
+          </w:tcPr>
+          <w:p>
+            <w:pPr>
+              <w:jc w:val="center"/>
+            </w:pPr>
+            <w:r>
+              <w:rPr>
+                <w:rFonts w:ascii="Calibri" w:hAnsi="Calibri"/>
+                <w:sz w:val="22"/>
+              </w:rPr>
+              <w:t>In situ opponent</w:t>
+            </w:r>
+          </w:p>
+        </w:tc>
+        <w:tc>
+          <w:tcPr>
+            <w:tcW w:type="dxa" w:w="1560"/>
+          </w:tcPr>
+          <w:p>
+            <w:pPr>
+              <w:jc w:val="center"/>
+            </w:pPr>
+            <w:r>
+              <w:rPr>
+                <w:rFonts w:ascii="Calibri" w:hAnsi="Calibri"/>
+                <w:sz w:val="22"/>
+              </w:rPr>
+              <w:t>3.6</w:t>
+            </w:r>
+          </w:p>
+        </w:tc>
+        <w:tc>
+          <w:tcPr>
+            <w:tcW w:type="dxa" w:w="1560"/>
+          </w:tcPr>
+          <w:p>
+            <w:pPr>
+              <w:jc w:val="center"/>
+            </w:pPr>
+            <w:r>
+              <w:rPr>
+                <w:rFonts w:ascii="Calibri" w:hAnsi="Calibri"/>
+                <w:sz w:val="22"/>
+              </w:rPr>
+              <w:t>3.0</w:t>
+            </w:r>
+          </w:p>
+        </w:tc>
+        <w:tc>
+          <w:tcPr>
+            <w:tcW w:type="dxa" w:w="1560"/>
+          </w:tcPr>
+          <w:p>
+            <w:pPr>
+              <w:jc w:val="center"/>
+            </w:pPr>
+            <w:r>
+              <w:rPr>
+                <w:rFonts w:ascii="Calibri" w:hAnsi="Calibri"/>
+                <w:sz w:val="22"/>
+              </w:rPr>
+              <w:t>0.7</w:t>
+            </w:r>
+          </w:p>
+        </w:tc>
+        <w:tc>
+          <w:tcPr>
+            <w:tcW w:type="dxa" w:w="1560"/>
+          </w:tcPr>
+          <w:p>
+            <w:pPr>
+              <w:jc w:val="center"/>
+            </w:pPr>
+            <w:r>
+              <w:rPr>
+                <w:rFonts w:ascii="Calibri" w:hAnsi="Calibri"/>
+                <w:sz w:val="22"/>
+              </w:rPr>
+              <w:t>16.2</w:t>
+            </w:r>
+          </w:p>
+        </w:tc>
+      </w:tr>
+      <w:tr>
+        <w:tc>
+          <w:tcPr>
+            <w:tcW w:type="dxa" w:w="1560"/>
           </w:tcPr>
           <w:p>
             <w:pPr>
@@ -330,7 +1210,24 @@
         </w:tc>
         <w:tc>
           <w:tcPr>
-            <w:tcW w:type="dxa" w:w="1872"/>
+            <w:tcW w:type="dxa" w:w="1560"/>
+          </w:tcPr>
+          <w:p>
+            <w:pPr>
+              <w:jc w:val="center"/>
+            </w:pPr>
+            <w:r>
+              <w:rPr>
+                <w:rFonts w:ascii="Calibri" w:hAnsi="Calibri"/>
+                <w:sz w:val="22"/>
+              </w:rPr>
+              <w:t>Across conditions</w:t>
+            </w:r>
+          </w:p>
+        </w:tc>
+        <w:tc>
+          <w:tcPr>
+            <w:tcW w:type="dxa" w:w="1560"/>
           </w:tcPr>
           <w:p>
             <w:pPr>
@@ -347,7 +1244,7 @@
         </w:tc>
         <w:tc>
           <w:tcPr>
-            <w:tcW w:type="dxa" w:w="1872"/>
+            <w:tcW w:type="dxa" w:w="1560"/>
           </w:tcPr>
           <w:p>
             <w:pPr>
@@ -364,7 +1261,7 @@
         </w:tc>
         <w:tc>
           <w:tcPr>
-            <w:tcW w:type="dxa" w:w="1872"/>
+            <w:tcW w:type="dxa" w:w="1560"/>
           </w:tcPr>
           <w:p>
             <w:pPr>
@@ -381,7 +1278,7 @@
         </w:tc>
         <w:tc>
           <w:tcPr>
-            <w:tcW w:type="dxa" w:w="1872"/>
+            <w:tcW w:type="dxa" w:w="1560"/>
           </w:tcPr>
           <w:p>
             <w:pPr>
@@ -400,7 +1297,419 @@
       <w:tr>
         <w:tc>
           <w:tcPr>
-            <w:tcW w:type="dxa" w:w="1872"/>
+            <w:tcW w:type="dxa" w:w="1560"/>
+          </w:tcPr>
+          <w:p>
+            <w:pPr>
+              <w:jc w:val="center"/>
+            </w:pPr>
+            <w:r>
+              <w:rPr>
+                <w:rFonts w:ascii="Calibri" w:hAnsi="Calibri"/>
+                <w:sz w:val="22"/>
+              </w:rPr>
+            </w:r>
+          </w:p>
+        </w:tc>
+        <w:tc>
+          <w:tcPr>
+            <w:tcW w:type="dxa" w:w="1560"/>
+          </w:tcPr>
+          <w:p>
+            <w:pPr>
+              <w:jc w:val="center"/>
+            </w:pPr>
+            <w:r>
+              <w:rPr>
+                <w:rFonts w:ascii="Calibri" w:hAnsi="Calibri"/>
+                <w:sz w:val="22"/>
+              </w:rPr>
+              <w:t>No-opponent</w:t>
+            </w:r>
+          </w:p>
+        </w:tc>
+        <w:tc>
+          <w:tcPr>
+            <w:tcW w:type="dxa" w:w="1560"/>
+          </w:tcPr>
+          <w:p>
+            <w:pPr>
+              <w:jc w:val="center"/>
+            </w:pPr>
+            <w:r>
+              <w:rPr>
+                <w:rFonts w:ascii="Calibri" w:hAnsi="Calibri"/>
+                <w:sz w:val="22"/>
+              </w:rPr>
+              <w:t>1.6</w:t>
+            </w:r>
+          </w:p>
+        </w:tc>
+        <w:tc>
+          <w:tcPr>
+            <w:tcW w:type="dxa" w:w="1560"/>
+          </w:tcPr>
+          <w:p>
+            <w:pPr>
+              <w:jc w:val="center"/>
+            </w:pPr>
+            <w:r>
+              <w:rPr>
+                <w:rFonts w:ascii="Calibri" w:hAnsi="Calibri"/>
+                <w:sz w:val="22"/>
+              </w:rPr>
+              <w:t>0.4</w:t>
+            </w:r>
+          </w:p>
+        </w:tc>
+        <w:tc>
+          <w:tcPr>
+            <w:tcW w:type="dxa" w:w="1560"/>
+          </w:tcPr>
+          <w:p>
+            <w:pPr>
+              <w:jc w:val="center"/>
+            </w:pPr>
+            <w:r>
+              <w:rPr>
+                <w:rFonts w:ascii="Calibri" w:hAnsi="Calibri"/>
+                <w:sz w:val="22"/>
+              </w:rPr>
+              <w:t>0.7</w:t>
+            </w:r>
+          </w:p>
+        </w:tc>
+        <w:tc>
+          <w:tcPr>
+            <w:tcW w:type="dxa" w:w="1560"/>
+          </w:tcPr>
+          <w:p>
+            <w:pPr>
+              <w:jc w:val="center"/>
+            </w:pPr>
+            <w:r>
+              <w:rPr>
+                <w:rFonts w:ascii="Calibri" w:hAnsi="Calibri"/>
+                <w:sz w:val="22"/>
+              </w:rPr>
+              <w:t>2.8</w:t>
+            </w:r>
+          </w:p>
+        </w:tc>
+      </w:tr>
+      <w:tr>
+        <w:tc>
+          <w:tcPr>
+            <w:tcW w:type="dxa" w:w="1560"/>
+          </w:tcPr>
+          <w:p>
+            <w:pPr>
+              <w:jc w:val="center"/>
+            </w:pPr>
+            <w:r>
+              <w:rPr>
+                <w:rFonts w:ascii="Calibri" w:hAnsi="Calibri"/>
+                <w:sz w:val="22"/>
+              </w:rPr>
+            </w:r>
+          </w:p>
+        </w:tc>
+        <w:tc>
+          <w:tcPr>
+            <w:tcW w:type="dxa" w:w="1560"/>
+          </w:tcPr>
+          <w:p>
+            <w:pPr>
+              <w:jc w:val="center"/>
+            </w:pPr>
+            <w:r>
+              <w:rPr>
+                <w:rFonts w:ascii="Calibri" w:hAnsi="Calibri"/>
+                <w:sz w:val="22"/>
+              </w:rPr>
+              <w:t>Non-interactive opponent</w:t>
+            </w:r>
+          </w:p>
+        </w:tc>
+        <w:tc>
+          <w:tcPr>
+            <w:tcW w:type="dxa" w:w="1560"/>
+          </w:tcPr>
+          <w:p>
+            <w:pPr>
+              <w:jc w:val="center"/>
+            </w:pPr>
+            <w:r>
+              <w:rPr>
+                <w:rFonts w:ascii="Calibri" w:hAnsi="Calibri"/>
+                <w:sz w:val="22"/>
+              </w:rPr>
+              <w:t>1.6</w:t>
+            </w:r>
+          </w:p>
+        </w:tc>
+        <w:tc>
+          <w:tcPr>
+            <w:tcW w:type="dxa" w:w="1560"/>
+          </w:tcPr>
+          <w:p>
+            <w:pPr>
+              <w:jc w:val="center"/>
+            </w:pPr>
+            <w:r>
+              <w:rPr>
+                <w:rFonts w:ascii="Calibri" w:hAnsi="Calibri"/>
+                <w:sz w:val="22"/>
+              </w:rPr>
+              <w:t>0.4</w:t>
+            </w:r>
+          </w:p>
+        </w:tc>
+        <w:tc>
+          <w:tcPr>
+            <w:tcW w:type="dxa" w:w="1560"/>
+          </w:tcPr>
+          <w:p>
+            <w:pPr>
+              <w:jc w:val="center"/>
+            </w:pPr>
+            <w:r>
+              <w:rPr>
+                <w:rFonts w:ascii="Calibri" w:hAnsi="Calibri"/>
+                <w:sz w:val="22"/>
+              </w:rPr>
+              <w:t>0.2</w:t>
+            </w:r>
+          </w:p>
+        </w:tc>
+        <w:tc>
+          <w:tcPr>
+            <w:tcW w:type="dxa" w:w="1560"/>
+          </w:tcPr>
+          <w:p>
+            <w:pPr>
+              <w:jc w:val="center"/>
+            </w:pPr>
+            <w:r>
+              <w:rPr>
+                <w:rFonts w:ascii="Calibri" w:hAnsi="Calibri"/>
+                <w:sz w:val="22"/>
+              </w:rPr>
+              <w:t>3.0</w:t>
+            </w:r>
+          </w:p>
+        </w:tc>
+      </w:tr>
+      <w:tr>
+        <w:tc>
+          <w:tcPr>
+            <w:tcW w:type="dxa" w:w="1560"/>
+          </w:tcPr>
+          <w:p>
+            <w:pPr>
+              <w:jc w:val="center"/>
+            </w:pPr>
+            <w:r>
+              <w:rPr>
+                <w:rFonts w:ascii="Calibri" w:hAnsi="Calibri"/>
+                <w:sz w:val="22"/>
+              </w:rPr>
+            </w:r>
+          </w:p>
+        </w:tc>
+        <w:tc>
+          <w:tcPr>
+            <w:tcW w:type="dxa" w:w="1560"/>
+          </w:tcPr>
+          <w:p>
+            <w:pPr>
+              <w:jc w:val="center"/>
+            </w:pPr>
+            <w:r>
+              <w:rPr>
+                <w:rFonts w:ascii="Calibri" w:hAnsi="Calibri"/>
+                <w:sz w:val="22"/>
+              </w:rPr>
+              <w:t>Interactive opponent</w:t>
+            </w:r>
+          </w:p>
+        </w:tc>
+        <w:tc>
+          <w:tcPr>
+            <w:tcW w:type="dxa" w:w="1560"/>
+          </w:tcPr>
+          <w:p>
+            <w:pPr>
+              <w:jc w:val="center"/>
+            </w:pPr>
+            <w:r>
+              <w:rPr>
+                <w:rFonts w:ascii="Calibri" w:hAnsi="Calibri"/>
+                <w:sz w:val="22"/>
+              </w:rPr>
+              <w:t>1.5</w:t>
+            </w:r>
+          </w:p>
+        </w:tc>
+        <w:tc>
+          <w:tcPr>
+            <w:tcW w:type="dxa" w:w="1560"/>
+          </w:tcPr>
+          <w:p>
+            <w:pPr>
+              <w:jc w:val="center"/>
+            </w:pPr>
+            <w:r>
+              <w:rPr>
+                <w:rFonts w:ascii="Calibri" w:hAnsi="Calibri"/>
+                <w:sz w:val="22"/>
+              </w:rPr>
+              <w:t>0.5</w:t>
+            </w:r>
+          </w:p>
+        </w:tc>
+        <w:tc>
+          <w:tcPr>
+            <w:tcW w:type="dxa" w:w="1560"/>
+          </w:tcPr>
+          <w:p>
+            <w:pPr>
+              <w:jc w:val="center"/>
+            </w:pPr>
+            <w:r>
+              <w:rPr>
+                <w:rFonts w:ascii="Calibri" w:hAnsi="Calibri"/>
+                <w:sz w:val="22"/>
+              </w:rPr>
+              <w:t>0.3</w:t>
+            </w:r>
+          </w:p>
+        </w:tc>
+        <w:tc>
+          <w:tcPr>
+            <w:tcW w:type="dxa" w:w="1560"/>
+          </w:tcPr>
+          <w:p>
+            <w:pPr>
+              <w:jc w:val="center"/>
+            </w:pPr>
+            <w:r>
+              <w:rPr>
+                <w:rFonts w:ascii="Calibri" w:hAnsi="Calibri"/>
+                <w:sz w:val="22"/>
+              </w:rPr>
+              <w:t>3.0</w:t>
+            </w:r>
+          </w:p>
+        </w:tc>
+      </w:tr>
+      <w:tr>
+        <w:tc>
+          <w:tcPr>
+            <w:tcW w:type="dxa" w:w="1560"/>
+          </w:tcPr>
+          <w:p>
+            <w:pPr>
+              <w:jc w:val="center"/>
+            </w:pPr>
+            <w:r>
+              <w:rPr>
+                <w:rFonts w:ascii="Calibri" w:hAnsi="Calibri"/>
+                <w:sz w:val="22"/>
+              </w:rPr>
+            </w:r>
+          </w:p>
+        </w:tc>
+        <w:tc>
+          <w:tcPr>
+            <w:tcW w:type="dxa" w:w="1560"/>
+          </w:tcPr>
+          <w:p>
+            <w:pPr>
+              <w:jc w:val="center"/>
+            </w:pPr>
+            <w:r>
+              <w:rPr>
+                <w:rFonts w:ascii="Calibri" w:hAnsi="Calibri"/>
+                <w:sz w:val="22"/>
+              </w:rPr>
+              <w:t>In situ opponent</w:t>
+            </w:r>
+          </w:p>
+        </w:tc>
+        <w:tc>
+          <w:tcPr>
+            <w:tcW w:type="dxa" w:w="1560"/>
+          </w:tcPr>
+          <w:p>
+            <w:pPr>
+              <w:jc w:val="center"/>
+            </w:pPr>
+            <w:r>
+              <w:rPr>
+                <w:rFonts w:ascii="Calibri" w:hAnsi="Calibri"/>
+                <w:sz w:val="22"/>
+              </w:rPr>
+              <w:t>1.6</w:t>
+            </w:r>
+          </w:p>
+        </w:tc>
+        <w:tc>
+          <w:tcPr>
+            <w:tcW w:type="dxa" w:w="1560"/>
+          </w:tcPr>
+          <w:p>
+            <w:pPr>
+              <w:jc w:val="center"/>
+            </w:pPr>
+            <w:r>
+              <w:rPr>
+                <w:rFonts w:ascii="Calibri" w:hAnsi="Calibri"/>
+                <w:sz w:val="22"/>
+              </w:rPr>
+              <w:t>1.1</w:t>
+            </w:r>
+          </w:p>
+        </w:tc>
+        <w:tc>
+          <w:tcPr>
+            <w:tcW w:type="dxa" w:w="1560"/>
+          </w:tcPr>
+          <w:p>
+            <w:pPr>
+              <w:jc w:val="center"/>
+            </w:pPr>
+            <w:r>
+              <w:rPr>
+                <w:rFonts w:ascii="Calibri" w:hAnsi="Calibri"/>
+                <w:sz w:val="22"/>
+              </w:rPr>
+              <w:t>0.0</w:t>
+            </w:r>
+          </w:p>
+        </w:tc>
+        <w:tc>
+          <w:tcPr>
+            <w:tcW w:type="dxa" w:w="1560"/>
+          </w:tcPr>
+          <w:p>
+            <w:pPr>
+              <w:jc w:val="center"/>
+            </w:pPr>
+            <w:r>
+              <w:rPr>
+                <w:rFonts w:ascii="Calibri" w:hAnsi="Calibri"/>
+                <w:sz w:val="22"/>
+              </w:rPr>
+              <w:t>5.5</w:t>
+            </w:r>
+          </w:p>
+        </w:tc>
+      </w:tr>
+      <w:tr>
+        <w:tc>
+          <w:tcPr>
+            <w:tcW w:type="dxa" w:w="1560"/>
           </w:tcPr>
           <w:p>
             <w:pPr>
@@ -417,7 +1726,24 @@
         </w:tc>
         <w:tc>
           <w:tcPr>
-            <w:tcW w:type="dxa" w:w="1872"/>
+            <w:tcW w:type="dxa" w:w="1560"/>
+          </w:tcPr>
+          <w:p>
+            <w:pPr>
+              <w:jc w:val="center"/>
+            </w:pPr>
+            <w:r>
+              <w:rPr>
+                <w:rFonts w:ascii="Calibri" w:hAnsi="Calibri"/>
+                <w:sz w:val="22"/>
+              </w:rPr>
+              <w:t>Across conditions</w:t>
+            </w:r>
+          </w:p>
+        </w:tc>
+        <w:tc>
+          <w:tcPr>
+            <w:tcW w:type="dxa" w:w="1560"/>
           </w:tcPr>
           <w:p>
             <w:pPr>
@@ -434,7 +1760,7 @@
         </w:tc>
         <w:tc>
           <w:tcPr>
-            <w:tcW w:type="dxa" w:w="1872"/>
+            <w:tcW w:type="dxa" w:w="1560"/>
           </w:tcPr>
           <w:p>
             <w:pPr>
@@ -451,7 +1777,7 @@
         </w:tc>
         <w:tc>
           <w:tcPr>
-            <w:tcW w:type="dxa" w:w="1872"/>
+            <w:tcW w:type="dxa" w:w="1560"/>
           </w:tcPr>
           <w:p>
             <w:pPr>
@@ -468,7 +1794,7 @@
         </w:tc>
         <w:tc>
           <w:tcPr>
-            <w:tcW w:type="dxa" w:w="1872"/>
+            <w:tcW w:type="dxa" w:w="1560"/>
           </w:tcPr>
           <w:p>
             <w:pPr>
@@ -487,10 +1813,419 @@
       <w:tr>
         <w:tc>
           <w:tcPr>
-            <w:tcW w:type="dxa" w:w="1872"/>
-            <w:tcBorders>
-              <w:bottom w:sz="12" w:val="single"/>
-            </w:tcBorders>
+            <w:tcW w:type="dxa" w:w="1560"/>
+          </w:tcPr>
+          <w:p>
+            <w:pPr>
+              <w:jc w:val="center"/>
+            </w:pPr>
+            <w:r>
+              <w:rPr>
+                <w:rFonts w:ascii="Calibri" w:hAnsi="Calibri"/>
+                <w:sz w:val="22"/>
+              </w:rPr>
+            </w:r>
+          </w:p>
+        </w:tc>
+        <w:tc>
+          <w:tcPr>
+            <w:tcW w:type="dxa" w:w="1560"/>
+          </w:tcPr>
+          <w:p>
+            <w:pPr>
+              <w:jc w:val="center"/>
+            </w:pPr>
+            <w:r>
+              <w:rPr>
+                <w:rFonts w:ascii="Calibri" w:hAnsi="Calibri"/>
+                <w:sz w:val="22"/>
+              </w:rPr>
+              <w:t>No-opponent</w:t>
+            </w:r>
+          </w:p>
+        </w:tc>
+        <w:tc>
+          <w:tcPr>
+            <w:tcW w:type="dxa" w:w="1560"/>
+          </w:tcPr>
+          <w:p>
+            <w:pPr>
+              <w:jc w:val="center"/>
+            </w:pPr>
+            <w:r>
+              <w:rPr>
+                <w:rFonts w:ascii="Calibri" w:hAnsi="Calibri"/>
+                <w:sz w:val="22"/>
+              </w:rPr>
+              <w:t>1.2</w:t>
+            </w:r>
+          </w:p>
+        </w:tc>
+        <w:tc>
+          <w:tcPr>
+            <w:tcW w:type="dxa" w:w="1560"/>
+          </w:tcPr>
+          <w:p>
+            <w:pPr>
+              <w:jc w:val="center"/>
+            </w:pPr>
+            <w:r>
+              <w:rPr>
+                <w:rFonts w:ascii="Calibri" w:hAnsi="Calibri"/>
+                <w:sz w:val="22"/>
+              </w:rPr>
+              <w:t>0.4</w:t>
+            </w:r>
+          </w:p>
+        </w:tc>
+        <w:tc>
+          <w:tcPr>
+            <w:tcW w:type="dxa" w:w="1560"/>
+          </w:tcPr>
+          <w:p>
+            <w:pPr>
+              <w:jc w:val="center"/>
+            </w:pPr>
+            <w:r>
+              <w:rPr>
+                <w:rFonts w:ascii="Calibri" w:hAnsi="Calibri"/>
+                <w:sz w:val="22"/>
+              </w:rPr>
+              <w:t>0.3</w:t>
+            </w:r>
+          </w:p>
+        </w:tc>
+        <w:tc>
+          <w:tcPr>
+            <w:tcW w:type="dxa" w:w="1560"/>
+          </w:tcPr>
+          <w:p>
+            <w:pPr>
+              <w:jc w:val="center"/>
+            </w:pPr>
+            <w:r>
+              <w:rPr>
+                <w:rFonts w:ascii="Calibri" w:hAnsi="Calibri"/>
+                <w:sz w:val="22"/>
+              </w:rPr>
+              <w:t>3.2</w:t>
+            </w:r>
+          </w:p>
+        </w:tc>
+      </w:tr>
+      <w:tr>
+        <w:tc>
+          <w:tcPr>
+            <w:tcW w:type="dxa" w:w="1560"/>
+          </w:tcPr>
+          <w:p>
+            <w:pPr>
+              <w:jc w:val="center"/>
+            </w:pPr>
+            <w:r>
+              <w:rPr>
+                <w:rFonts w:ascii="Calibri" w:hAnsi="Calibri"/>
+                <w:sz w:val="22"/>
+              </w:rPr>
+            </w:r>
+          </w:p>
+        </w:tc>
+        <w:tc>
+          <w:tcPr>
+            <w:tcW w:type="dxa" w:w="1560"/>
+          </w:tcPr>
+          <w:p>
+            <w:pPr>
+              <w:jc w:val="center"/>
+            </w:pPr>
+            <w:r>
+              <w:rPr>
+                <w:rFonts w:ascii="Calibri" w:hAnsi="Calibri"/>
+                <w:sz w:val="22"/>
+              </w:rPr>
+              <w:t>Non-interactive opponent</w:t>
+            </w:r>
+          </w:p>
+        </w:tc>
+        <w:tc>
+          <w:tcPr>
+            <w:tcW w:type="dxa" w:w="1560"/>
+          </w:tcPr>
+          <w:p>
+            <w:pPr>
+              <w:jc w:val="center"/>
+            </w:pPr>
+            <w:r>
+              <w:rPr>
+                <w:rFonts w:ascii="Calibri" w:hAnsi="Calibri"/>
+                <w:sz w:val="22"/>
+              </w:rPr>
+              <w:t>1.5</w:t>
+            </w:r>
+          </w:p>
+        </w:tc>
+        <w:tc>
+          <w:tcPr>
+            <w:tcW w:type="dxa" w:w="1560"/>
+          </w:tcPr>
+          <w:p>
+            <w:pPr>
+              <w:jc w:val="center"/>
+            </w:pPr>
+            <w:r>
+              <w:rPr>
+                <w:rFonts w:ascii="Calibri" w:hAnsi="Calibri"/>
+                <w:sz w:val="22"/>
+              </w:rPr>
+              <w:t>0.4</w:t>
+            </w:r>
+          </w:p>
+        </w:tc>
+        <w:tc>
+          <w:tcPr>
+            <w:tcW w:type="dxa" w:w="1560"/>
+          </w:tcPr>
+          <w:p>
+            <w:pPr>
+              <w:jc w:val="center"/>
+            </w:pPr>
+            <w:r>
+              <w:rPr>
+                <w:rFonts w:ascii="Calibri" w:hAnsi="Calibri"/>
+                <w:sz w:val="22"/>
+              </w:rPr>
+              <w:t>0.3</w:t>
+            </w:r>
+          </w:p>
+        </w:tc>
+        <w:tc>
+          <w:tcPr>
+            <w:tcW w:type="dxa" w:w="1560"/>
+          </w:tcPr>
+          <w:p>
+            <w:pPr>
+              <w:jc w:val="center"/>
+            </w:pPr>
+            <w:r>
+              <w:rPr>
+                <w:rFonts w:ascii="Calibri" w:hAnsi="Calibri"/>
+                <w:sz w:val="22"/>
+              </w:rPr>
+              <w:t>3.3</w:t>
+            </w:r>
+          </w:p>
+        </w:tc>
+      </w:tr>
+      <w:tr>
+        <w:tc>
+          <w:tcPr>
+            <w:tcW w:type="dxa" w:w="1560"/>
+          </w:tcPr>
+          <w:p>
+            <w:pPr>
+              <w:jc w:val="center"/>
+            </w:pPr>
+            <w:r>
+              <w:rPr>
+                <w:rFonts w:ascii="Calibri" w:hAnsi="Calibri"/>
+                <w:sz w:val="22"/>
+              </w:rPr>
+            </w:r>
+          </w:p>
+        </w:tc>
+        <w:tc>
+          <w:tcPr>
+            <w:tcW w:type="dxa" w:w="1560"/>
+          </w:tcPr>
+          <w:p>
+            <w:pPr>
+              <w:jc w:val="center"/>
+            </w:pPr>
+            <w:r>
+              <w:rPr>
+                <w:rFonts w:ascii="Calibri" w:hAnsi="Calibri"/>
+                <w:sz w:val="22"/>
+              </w:rPr>
+              <w:t>Interactive opponent</w:t>
+            </w:r>
+          </w:p>
+        </w:tc>
+        <w:tc>
+          <w:tcPr>
+            <w:tcW w:type="dxa" w:w="1560"/>
+          </w:tcPr>
+          <w:p>
+            <w:pPr>
+              <w:jc w:val="center"/>
+            </w:pPr>
+            <w:r>
+              <w:rPr>
+                <w:rFonts w:ascii="Calibri" w:hAnsi="Calibri"/>
+                <w:sz w:val="22"/>
+              </w:rPr>
+              <w:t>1.4</w:t>
+            </w:r>
+          </w:p>
+        </w:tc>
+        <w:tc>
+          <w:tcPr>
+            <w:tcW w:type="dxa" w:w="1560"/>
+          </w:tcPr>
+          <w:p>
+            <w:pPr>
+              <w:jc w:val="center"/>
+            </w:pPr>
+            <w:r>
+              <w:rPr>
+                <w:rFonts w:ascii="Calibri" w:hAnsi="Calibri"/>
+                <w:sz w:val="22"/>
+              </w:rPr>
+              <w:t>0.4</w:t>
+            </w:r>
+          </w:p>
+        </w:tc>
+        <w:tc>
+          <w:tcPr>
+            <w:tcW w:type="dxa" w:w="1560"/>
+          </w:tcPr>
+          <w:p>
+            <w:pPr>
+              <w:jc w:val="center"/>
+            </w:pPr>
+            <w:r>
+              <w:rPr>
+                <w:rFonts w:ascii="Calibri" w:hAnsi="Calibri"/>
+                <w:sz w:val="22"/>
+              </w:rPr>
+              <w:t>0.7</w:t>
+            </w:r>
+          </w:p>
+        </w:tc>
+        <w:tc>
+          <w:tcPr>
+            <w:tcW w:type="dxa" w:w="1560"/>
+          </w:tcPr>
+          <w:p>
+            <w:pPr>
+              <w:jc w:val="center"/>
+            </w:pPr>
+            <w:r>
+              <w:rPr>
+                <w:rFonts w:ascii="Calibri" w:hAnsi="Calibri"/>
+                <w:sz w:val="22"/>
+              </w:rPr>
+              <w:t>3.2</w:t>
+            </w:r>
+          </w:p>
+        </w:tc>
+      </w:tr>
+      <w:tr>
+        <w:tc>
+          <w:tcPr>
+            <w:tcW w:type="dxa" w:w="1560"/>
+          </w:tcPr>
+          <w:p>
+            <w:pPr>
+              <w:jc w:val="center"/>
+            </w:pPr>
+            <w:r>
+              <w:rPr>
+                <w:rFonts w:ascii="Calibri" w:hAnsi="Calibri"/>
+                <w:sz w:val="22"/>
+              </w:rPr>
+            </w:r>
+          </w:p>
+        </w:tc>
+        <w:tc>
+          <w:tcPr>
+            <w:tcW w:type="dxa" w:w="1560"/>
+          </w:tcPr>
+          <w:p>
+            <w:pPr>
+              <w:jc w:val="center"/>
+            </w:pPr>
+            <w:r>
+              <w:rPr>
+                <w:rFonts w:ascii="Calibri" w:hAnsi="Calibri"/>
+                <w:sz w:val="22"/>
+              </w:rPr>
+              <w:t>In situ opponent</w:t>
+            </w:r>
+          </w:p>
+        </w:tc>
+        <w:tc>
+          <w:tcPr>
+            <w:tcW w:type="dxa" w:w="1560"/>
+          </w:tcPr>
+          <w:p>
+            <w:pPr>
+              <w:jc w:val="center"/>
+            </w:pPr>
+            <w:r>
+              <w:rPr>
+                <w:rFonts w:ascii="Calibri" w:hAnsi="Calibri"/>
+                <w:sz w:val="22"/>
+              </w:rPr>
+              <w:t>1.4</w:t>
+            </w:r>
+          </w:p>
+        </w:tc>
+        <w:tc>
+          <w:tcPr>
+            <w:tcW w:type="dxa" w:w="1560"/>
+          </w:tcPr>
+          <w:p>
+            <w:pPr>
+              <w:jc w:val="center"/>
+            </w:pPr>
+            <w:r>
+              <w:rPr>
+                <w:rFonts w:ascii="Calibri" w:hAnsi="Calibri"/>
+                <w:sz w:val="22"/>
+              </w:rPr>
+              <w:t>0.6</w:t>
+            </w:r>
+          </w:p>
+        </w:tc>
+        <w:tc>
+          <w:tcPr>
+            <w:tcW w:type="dxa" w:w="1560"/>
+          </w:tcPr>
+          <w:p>
+            <w:pPr>
+              <w:jc w:val="center"/>
+            </w:pPr>
+            <w:r>
+              <w:rPr>
+                <w:rFonts w:ascii="Calibri" w:hAnsi="Calibri"/>
+                <w:sz w:val="22"/>
+              </w:rPr>
+              <w:t>0.3</w:t>
+            </w:r>
+          </w:p>
+        </w:tc>
+        <w:tc>
+          <w:tcPr>
+            <w:tcW w:type="dxa" w:w="1560"/>
+          </w:tcPr>
+          <w:p>
+            <w:pPr>
+              <w:jc w:val="center"/>
+            </w:pPr>
+            <w:r>
+              <w:rPr>
+                <w:rFonts w:ascii="Calibri" w:hAnsi="Calibri"/>
+                <w:sz w:val="22"/>
+              </w:rPr>
+              <w:t>4.3</w:t>
+            </w:r>
+          </w:p>
+        </w:tc>
+      </w:tr>
+      <w:tr>
+        <w:tc>
+          <w:tcPr>
+            <w:tcW w:type="dxa" w:w="1560"/>
           </w:tcPr>
           <w:p>
             <w:pPr>
@@ -507,10 +2242,24 @@
         </w:tc>
         <w:tc>
           <w:tcPr>
-            <w:tcW w:type="dxa" w:w="1872"/>
-            <w:tcBorders>
-              <w:bottom w:sz="12" w:val="single"/>
-            </w:tcBorders>
+            <w:tcW w:type="dxa" w:w="1560"/>
+          </w:tcPr>
+          <w:p>
+            <w:pPr>
+              <w:jc w:val="center"/>
+            </w:pPr>
+            <w:r>
+              <w:rPr>
+                <w:rFonts w:ascii="Calibri" w:hAnsi="Calibri"/>
+                <w:sz w:val="22"/>
+              </w:rPr>
+              <w:t>Across conditions</w:t>
+            </w:r>
+          </w:p>
+        </w:tc>
+        <w:tc>
+          <w:tcPr>
+            <w:tcW w:type="dxa" w:w="1560"/>
           </w:tcPr>
           <w:p>
             <w:pPr>
@@ -527,10 +2276,7 @@
         </w:tc>
         <w:tc>
           <w:tcPr>
-            <w:tcW w:type="dxa" w:w="1872"/>
-            <w:tcBorders>
-              <w:bottom w:sz="12" w:val="single"/>
-            </w:tcBorders>
+            <w:tcW w:type="dxa" w:w="1560"/>
           </w:tcPr>
           <w:p>
             <w:pPr>
@@ -547,7 +2293,431 @@
         </w:tc>
         <w:tc>
           <w:tcPr>
-            <w:tcW w:type="dxa" w:w="1872"/>
+            <w:tcW w:type="dxa" w:w="1560"/>
+          </w:tcPr>
+          <w:p>
+            <w:pPr>
+              <w:jc w:val="center"/>
+            </w:pPr>
+            <w:r>
+              <w:rPr>
+                <w:rFonts w:ascii="Calibri" w:hAnsi="Calibri"/>
+                <w:sz w:val="22"/>
+              </w:rPr>
+              <w:t>0.0</w:t>
+            </w:r>
+          </w:p>
+        </w:tc>
+        <w:tc>
+          <w:tcPr>
+            <w:tcW w:type="dxa" w:w="1560"/>
+          </w:tcPr>
+          <w:p>
+            <w:pPr>
+              <w:jc w:val="center"/>
+            </w:pPr>
+            <w:r>
+              <w:rPr>
+                <w:rFonts w:ascii="Calibri" w:hAnsi="Calibri"/>
+                <w:sz w:val="22"/>
+              </w:rPr>
+              <w:t>10.0</w:t>
+            </w:r>
+          </w:p>
+        </w:tc>
+      </w:tr>
+      <w:tr>
+        <w:tc>
+          <w:tcPr>
+            <w:tcW w:type="dxa" w:w="1560"/>
+          </w:tcPr>
+          <w:p>
+            <w:pPr>
+              <w:jc w:val="center"/>
+            </w:pPr>
+            <w:r>
+              <w:rPr>
+                <w:rFonts w:ascii="Calibri" w:hAnsi="Calibri"/>
+                <w:sz w:val="22"/>
+              </w:rPr>
+            </w:r>
+          </w:p>
+        </w:tc>
+        <w:tc>
+          <w:tcPr>
+            <w:tcW w:type="dxa" w:w="1560"/>
+          </w:tcPr>
+          <w:p>
+            <w:pPr>
+              <w:jc w:val="center"/>
+            </w:pPr>
+            <w:r>
+              <w:rPr>
+                <w:rFonts w:ascii="Calibri" w:hAnsi="Calibri"/>
+                <w:sz w:val="22"/>
+              </w:rPr>
+              <w:t>No-opponent</w:t>
+            </w:r>
+          </w:p>
+        </w:tc>
+        <w:tc>
+          <w:tcPr>
+            <w:tcW w:type="dxa" w:w="1560"/>
+          </w:tcPr>
+          <w:p>
+            <w:pPr>
+              <w:jc w:val="center"/>
+            </w:pPr>
+            <w:r>
+              <w:rPr>
+                <w:rFonts w:ascii="Calibri" w:hAnsi="Calibri"/>
+                <w:sz w:val="22"/>
+              </w:rPr>
+              <w:t>0.4</w:t>
+            </w:r>
+          </w:p>
+        </w:tc>
+        <w:tc>
+          <w:tcPr>
+            <w:tcW w:type="dxa" w:w="1560"/>
+          </w:tcPr>
+          <w:p>
+            <w:pPr>
+              <w:jc w:val="center"/>
+            </w:pPr>
+            <w:r>
+              <w:rPr>
+                <w:rFonts w:ascii="Calibri" w:hAnsi="Calibri"/>
+                <w:sz w:val="22"/>
+              </w:rPr>
+              <w:t>0.6</w:t>
+            </w:r>
+          </w:p>
+        </w:tc>
+        <w:tc>
+          <w:tcPr>
+            <w:tcW w:type="dxa" w:w="1560"/>
+          </w:tcPr>
+          <w:p>
+            <w:pPr>
+              <w:jc w:val="center"/>
+            </w:pPr>
+            <w:r>
+              <w:rPr>
+                <w:rFonts w:ascii="Calibri" w:hAnsi="Calibri"/>
+                <w:sz w:val="22"/>
+              </w:rPr>
+              <w:t>0.0</w:t>
+            </w:r>
+          </w:p>
+        </w:tc>
+        <w:tc>
+          <w:tcPr>
+            <w:tcW w:type="dxa" w:w="1560"/>
+          </w:tcPr>
+          <w:p>
+            <w:pPr>
+              <w:jc w:val="center"/>
+            </w:pPr>
+            <w:r>
+              <w:rPr>
+                <w:rFonts w:ascii="Calibri" w:hAnsi="Calibri"/>
+                <w:sz w:val="22"/>
+              </w:rPr>
+              <w:t>3.0</w:t>
+            </w:r>
+          </w:p>
+        </w:tc>
+      </w:tr>
+      <w:tr>
+        <w:tc>
+          <w:tcPr>
+            <w:tcW w:type="dxa" w:w="1560"/>
+          </w:tcPr>
+          <w:p>
+            <w:pPr>
+              <w:jc w:val="center"/>
+            </w:pPr>
+            <w:r>
+              <w:rPr>
+                <w:rFonts w:ascii="Calibri" w:hAnsi="Calibri"/>
+                <w:sz w:val="22"/>
+              </w:rPr>
+            </w:r>
+          </w:p>
+        </w:tc>
+        <w:tc>
+          <w:tcPr>
+            <w:tcW w:type="dxa" w:w="1560"/>
+          </w:tcPr>
+          <w:p>
+            <w:pPr>
+              <w:jc w:val="center"/>
+            </w:pPr>
+            <w:r>
+              <w:rPr>
+                <w:rFonts w:ascii="Calibri" w:hAnsi="Calibri"/>
+                <w:sz w:val="22"/>
+              </w:rPr>
+              <w:t>Non-interactive opponent</w:t>
+            </w:r>
+          </w:p>
+        </w:tc>
+        <w:tc>
+          <w:tcPr>
+            <w:tcW w:type="dxa" w:w="1560"/>
+          </w:tcPr>
+          <w:p>
+            <w:pPr>
+              <w:jc w:val="center"/>
+            </w:pPr>
+            <w:r>
+              <w:rPr>
+                <w:rFonts w:ascii="Calibri" w:hAnsi="Calibri"/>
+                <w:sz w:val="22"/>
+              </w:rPr>
+              <w:t>0.7</w:t>
+            </w:r>
+          </w:p>
+        </w:tc>
+        <w:tc>
+          <w:tcPr>
+            <w:tcW w:type="dxa" w:w="1560"/>
+          </w:tcPr>
+          <w:p>
+            <w:pPr>
+              <w:jc w:val="center"/>
+            </w:pPr>
+            <w:r>
+              <w:rPr>
+                <w:rFonts w:ascii="Calibri" w:hAnsi="Calibri"/>
+                <w:sz w:val="22"/>
+              </w:rPr>
+              <w:t>0.8</w:t>
+            </w:r>
+          </w:p>
+        </w:tc>
+        <w:tc>
+          <w:tcPr>
+            <w:tcW w:type="dxa" w:w="1560"/>
+          </w:tcPr>
+          <w:p>
+            <w:pPr>
+              <w:jc w:val="center"/>
+            </w:pPr>
+            <w:r>
+              <w:rPr>
+                <w:rFonts w:ascii="Calibri" w:hAnsi="Calibri"/>
+                <w:sz w:val="22"/>
+              </w:rPr>
+              <w:t>0.0</w:t>
+            </w:r>
+          </w:p>
+        </w:tc>
+        <w:tc>
+          <w:tcPr>
+            <w:tcW w:type="dxa" w:w="1560"/>
+          </w:tcPr>
+          <w:p>
+            <w:pPr>
+              <w:jc w:val="center"/>
+            </w:pPr>
+            <w:r>
+              <w:rPr>
+                <w:rFonts w:ascii="Calibri" w:hAnsi="Calibri"/>
+                <w:sz w:val="22"/>
+              </w:rPr>
+              <w:t>3.0</w:t>
+            </w:r>
+          </w:p>
+        </w:tc>
+      </w:tr>
+      <w:tr>
+        <w:tc>
+          <w:tcPr>
+            <w:tcW w:type="dxa" w:w="1560"/>
+          </w:tcPr>
+          <w:p>
+            <w:pPr>
+              <w:jc w:val="center"/>
+            </w:pPr>
+            <w:r>
+              <w:rPr>
+                <w:rFonts w:ascii="Calibri" w:hAnsi="Calibri"/>
+                <w:sz w:val="22"/>
+              </w:rPr>
+            </w:r>
+          </w:p>
+        </w:tc>
+        <w:tc>
+          <w:tcPr>
+            <w:tcW w:type="dxa" w:w="1560"/>
+          </w:tcPr>
+          <w:p>
+            <w:pPr>
+              <w:jc w:val="center"/>
+            </w:pPr>
+            <w:r>
+              <w:rPr>
+                <w:rFonts w:ascii="Calibri" w:hAnsi="Calibri"/>
+                <w:sz w:val="22"/>
+              </w:rPr>
+              <w:t>Interactive opponent</w:t>
+            </w:r>
+          </w:p>
+        </w:tc>
+        <w:tc>
+          <w:tcPr>
+            <w:tcW w:type="dxa" w:w="1560"/>
+          </w:tcPr>
+          <w:p>
+            <w:pPr>
+              <w:jc w:val="center"/>
+            </w:pPr>
+            <w:r>
+              <w:rPr>
+                <w:rFonts w:ascii="Calibri" w:hAnsi="Calibri"/>
+                <w:sz w:val="22"/>
+              </w:rPr>
+              <w:t>1.5</w:t>
+            </w:r>
+          </w:p>
+        </w:tc>
+        <w:tc>
+          <w:tcPr>
+            <w:tcW w:type="dxa" w:w="1560"/>
+          </w:tcPr>
+          <w:p>
+            <w:pPr>
+              <w:jc w:val="center"/>
+            </w:pPr>
+            <w:r>
+              <w:rPr>
+                <w:rFonts w:ascii="Calibri" w:hAnsi="Calibri"/>
+                <w:sz w:val="22"/>
+              </w:rPr>
+              <w:t>1.2</w:t>
+            </w:r>
+          </w:p>
+        </w:tc>
+        <w:tc>
+          <w:tcPr>
+            <w:tcW w:type="dxa" w:w="1560"/>
+          </w:tcPr>
+          <w:p>
+            <w:pPr>
+              <w:jc w:val="center"/>
+            </w:pPr>
+            <w:r>
+              <w:rPr>
+                <w:rFonts w:ascii="Calibri" w:hAnsi="Calibri"/>
+                <w:sz w:val="22"/>
+              </w:rPr>
+              <w:t>0.0</w:t>
+            </w:r>
+          </w:p>
+        </w:tc>
+        <w:tc>
+          <w:tcPr>
+            <w:tcW w:type="dxa" w:w="1560"/>
+          </w:tcPr>
+          <w:p>
+            <w:pPr>
+              <w:jc w:val="center"/>
+            </w:pPr>
+            <w:r>
+              <w:rPr>
+                <w:rFonts w:ascii="Calibri" w:hAnsi="Calibri"/>
+                <w:sz w:val="22"/>
+              </w:rPr>
+              <w:t>6.0</w:t>
+            </w:r>
+          </w:p>
+        </w:tc>
+      </w:tr>
+      <w:tr>
+        <w:tc>
+          <w:tcPr>
+            <w:tcW w:type="dxa" w:w="1560"/>
+            <w:tcBorders>
+              <w:bottom w:sz="12" w:val="single"/>
+            </w:tcBorders>
+          </w:tcPr>
+          <w:p>
+            <w:pPr>
+              <w:jc w:val="center"/>
+            </w:pPr>
+            <w:r>
+              <w:rPr>
+                <w:rFonts w:ascii="Calibri" w:hAnsi="Calibri"/>
+                <w:sz w:val="22"/>
+              </w:rPr>
+            </w:r>
+          </w:p>
+        </w:tc>
+        <w:tc>
+          <w:tcPr>
+            <w:tcW w:type="dxa" w:w="1560"/>
+            <w:tcBorders>
+              <w:bottom w:sz="12" w:val="single"/>
+            </w:tcBorders>
+          </w:tcPr>
+          <w:p>
+            <w:pPr>
+              <w:jc w:val="center"/>
+            </w:pPr>
+            <w:r>
+              <w:rPr>
+                <w:rFonts w:ascii="Calibri" w:hAnsi="Calibri"/>
+                <w:sz w:val="22"/>
+              </w:rPr>
+              <w:t>In situ opponent</w:t>
+            </w:r>
+          </w:p>
+        </w:tc>
+        <w:tc>
+          <w:tcPr>
+            <w:tcW w:type="dxa" w:w="1560"/>
+            <w:tcBorders>
+              <w:bottom w:sz="12" w:val="single"/>
+            </w:tcBorders>
+          </w:tcPr>
+          <w:p>
+            <w:pPr>
+              <w:jc w:val="center"/>
+            </w:pPr>
+            <w:r>
+              <w:rPr>
+                <w:rFonts w:ascii="Calibri" w:hAnsi="Calibri"/>
+                <w:sz w:val="22"/>
+              </w:rPr>
+              <w:t>2.1</w:t>
+            </w:r>
+          </w:p>
+        </w:tc>
+        <w:tc>
+          <w:tcPr>
+            <w:tcW w:type="dxa" w:w="1560"/>
+            <w:tcBorders>
+              <w:bottom w:sz="12" w:val="single"/>
+            </w:tcBorders>
+          </w:tcPr>
+          <w:p>
+            <w:pPr>
+              <w:jc w:val="center"/>
+            </w:pPr>
+            <w:r>
+              <w:rPr>
+                <w:rFonts w:ascii="Calibri" w:hAnsi="Calibri"/>
+                <w:sz w:val="22"/>
+              </w:rPr>
+              <w:t>2.1</w:t>
+            </w:r>
+          </w:p>
+        </w:tc>
+        <w:tc>
+          <w:tcPr>
+            <w:tcW w:type="dxa" w:w="1560"/>
             <w:tcBorders>
               <w:bottom w:sz="12" w:val="single"/>
             </w:tcBorders>
@@ -567,7 +2737,7 @@
         </w:tc>
         <w:tc>
           <w:tcPr>
-            <w:tcW w:type="dxa" w:w="1872"/>
+            <w:tcW w:type="dxa" w:w="1560"/>
             <w:tcBorders>
               <w:bottom w:sz="12" w:val="single"/>
             </w:tcBorders>

</xml_diff>